<commit_message>
Finish the VAL-801–VAL-824 clinician-review packages.
The nine held charts get narrower repairs from the recovered sources. Clean cases that pass move into a separate review document, and the held audit stays empty.

Co-authored-by: piaattufts <piaattufts@users.noreply.github.com>
</commit_message>
<xml_diff>
--- a/exports/ko_revised_cases_v1/KO_REVISED_CASES_REVIEW.docx
+++ b/exports/ko_revised_cases_v1/KO_REVISED_CASES_REVIEW.docx
@@ -8848,7 +8848,7 @@
     </w:p>
     <w:p>
       <w:r>
-        <w:t>Which HFrEF therapies, if any, should be required versus acceptable alternatives given ejection fraction 30 percent, systolic blood pressure 110 mmHg, creatinine 0.9 mg/dL, and potassium 4.3 mmol/L?</w:t>
+        <w:t>Given the discharge clinical status, which additional heart-failure therapies, if any, should be considered required versus acceptable alternatives? Ejection fraction is 30 percent, systolic blood pressure is 110 mmHg, creatinine is 0.9 mg/dL, and potassium is 4.3 mmol/L.</w:t>
       </w:r>
     </w:p>
     <w:tbl>
@@ -13458,7 +13458,7 @@
     </w:p>
     <w:p>
       <w:r>
-        <w:t>Is continuing mycophenolate at discharge appropriate in this CMV and transplant context?</w:t>
+        <w:t>Given the CMV disease and transplant context, is continuation of mycophenolate at discharge clinically appropriate, or should the regimen be modified or temporarily held?</w:t>
       </w:r>
     </w:p>
     <w:p>

</xml_diff>